<commit_message>
Rewrite 国内外研究进展 and remap references to [1]-[26]
Agent-Logs-Url: https://github.com/7xjj7/-/sessions/5c6cab28-1790-4d81-9929-61df09fcd074

Co-authored-by: 7xjj7 <272778956+7xjj7@users.noreply.github.com>
</commit_message>
<xml_diff>
--- a/开题报告.docx
+++ b/开题报告.docx
@@ -1677,7 +1677,7 @@
               </w:rPr>
             </w:pPr>
             <w:r>
-              <w:t>1. 全球变暖背景下的作物高温风险</w:t>
+              <w:t>全球气候变暖已成为影响粮食安全的关键背景变量。已有研究显示，过去几十年气候趋势已对主要作物产量造成实质性负效应，其中玉米受影响尤为明显[1]。多模型综合评估进一步表明，全球平均温度每升高1℃将导致玉米显著减产，且该结论在不同估算框架下具有较高一致性[2]。同时，极端高温与复合灾害事件会显著放大年际减产风险，提示高温胁迫研究具有明确的现实紧迫性[3]。</w:t>
             </w:r>
           </w:p>
           <w:p ns2:paraId="43B38655">
@@ -1704,7 +1704,7 @@
               </w:rPr>
             </w:pPr>
             <w:r>
-              <w:t>已有研究表明，全球气候变化已对主要粮食作物产量造成持续影响，气候趋势与极端天气事件均会显著增加减产风险[1][2][3]。</w:t>
+              <w:t>在作物响应层面，高温胁迫可同时作用于“源—流—库”多个环节。研究表明，温度异常会抑制光合作用并改变同化物分配，进而影响器官建成和产量形成[4]。植物对高温的适应涉及膜稳定性维持、热激蛋白与信号网络重塑等多层机制[5][6]；与此同时，活性氧代谢失衡与抗氧化系统负荷增加是热害发生的重要生理基础[7]。</w:t>
             </w:r>
           </w:p>
           <w:p ns2:paraId="55DC1626">
@@ -1733,7 +1733,7 @@
               </w:rPr>
             </w:pPr>
             <w:r>
-              <w:t>2. 高温胁迫对作物生长与灌浆的普遍影响</w:t>
+              <w:t>已有文献普遍认为，生殖生长期是热敏性最强的阶段之一。高温可通过削弱生殖器官活力、干扰受精过程以及抑制后续灌浆同化物输入，最终导致结实率和粒重下降[8]。在玉米相关研究中，灌浆前期胚乳细胞分裂受抑是粒重损失的重要结构基础[9]；同时，蔗糖代谢与淀粉合成关键酶在高温下活性下降，会进一步限制籽粒充实[10][11]。</w:t>
             </w:r>
           </w:p>
           <w:p ns2:paraId="6279326A">
@@ -1760,7 +1760,7 @@
               </w:rPr>
             </w:pPr>
             <w:r>
-              <w:t>高温会系统性影响作物生长发育过程，包括光合能力下降、物质同化受限和灌浆进程缩短，从而影响最终产量形成[4][5][6][7]。</w:t>
+              <w:t>围绕“高温—败育”生理链条，国内外研究已形成若干关键认识。其一，蔗糖输入与转化过程受阻会削弱库强并诱发败育风险[12]；其二，激素平衡改变（如ABA、IAA、ZR等）与籽粒发育障碍密切相关[13]；其三，糖信号与细胞命运调控之间存在耦合关系，可能决定胁迫条件下籽粒发育结局[14]。这些结果为解析甜玉米灌浆期败育机制提供了理论参照。</w:t>
             </w:r>
           </w:p>
           <w:p ns2:paraId="4DE20860">
@@ -1789,7 +1789,7 @@
               </w:rPr>
             </w:pPr>
             <w:r>
-              <w:t>3. 生殖生长期热害机理研究</w:t>
+              <w:t>在氧化生理方面，研究显示高温条件下ROS积累与膜脂过氧化增强常与败育程度同步变化，且与抗氧化酶系统状态显著相关[15]。耐热基因型通常表现为更稳定的SOD、POD、CAT活性和更低的MDA积累，说明抗氧化防御能力是区分耐热差异的重要生化基础[16]。</w:t>
             </w:r>
           </w:p>
           <w:p ns2:paraId="4D0C5F53">
@@ -1816,7 +1816,7 @@
               </w:rPr>
             </w:pPr>
             <w:r>
-              <w:t>生殖生长期对高温最为敏感，热胁迫可通过影响受精结实、花器官活力和同化物分配导致结实率下降；相关机理研究已在谷类与豆类作物中得到较充分证据支持[8][9][10][11]。</w:t>
+              <w:t>相较普通玉米，甜玉米在高温下的品质维度问题更为突出。已有研究指出，甜玉米高糖形成机制决定其对灌浆期环境波动更加敏感，高温不仅影响产量，还会显著改变可溶性糖与淀粉平衡[17]。进一步研究表明，灌浆期高温会导致甜度下降、质构变硬、商品性降低[18][19]，并引起关键挥发性香气成分减少，造成风味劣变[20]。</w:t>
             </w:r>
           </w:p>
           <w:p ns2:paraId="29EAF42A">
@@ -1843,7 +1843,7 @@
               </w:rPr>
             </w:pPr>
             <w:r>
-              <w:t>4. 玉米与甜玉米研究现状及不足</w:t>
+              <w:t>品种间差异是当前研究的另一重点方向。多项研究证实，不同玉米材料在高温条件下的减产幅度和恢复能力差异显著[21]。基于综合指标构建的耐热评价方法可提高材料筛选效率[22]；经典生殖热害研究也提示，花器官与受精过程对短时高温极为敏感，是后续灌浆表现差异的重要前因[23]。</w:t>
             </w:r>
           </w:p>
           <w:p ns2:paraId="29C796B5">
@@ -1870,7 +1870,7 @@
               </w:rPr>
             </w:pPr>
             <w:r>
-              <w:t>针对玉米，高温胁迫下的生理生化与分子响应已有综述性总结[12]；但面向甜玉米具体品种（如粤甜16、浙甜922）在灌浆期高温条件下“产量-品质协同变化”的系统研究仍相对不足[13][14]。</w:t>
+              <w:t>结合区域生产实践，华南夏季高温频发且持续时间长，甜玉米灌浆关键期与高温高湿气候高度重叠，已成为制约优质稳产的主要生态因素[24][25]。因此，在区域背景下开展灌浆期高温响应研究具有直接应用价值。</w:t>
             </w:r>
           </w:p>
           <w:p ns2:paraId="241B52E0">
@@ -1897,7 +1897,7 @@
               </w:rPr>
             </w:pPr>
             <w:r>
-              <w:t>综上，现有文献已明确高温风险与一般作用机制，但对甜玉米灌浆期高温下籽粒发育与品质劣变的耦合机制仍需进一步细化。</w:t>
+              <w:t>总体来看，现有研究已从气候风险、作物生理、生殖热害到品质变化等层面提供了较扎实基础，但针对甜玉米特定品种在灌浆期高温下“败育发生—生理生化响应—品质劣变”之间的耦合机制仍缺乏系统整合；尤其是围绕淀粉合成热敏瓶颈环节（如AGPase）的证据链仍需进一步细化[26]。本研究将围绕上述空缺开展针对性验证，以期为甜玉米耐热保质栽培与品种选育提供依据。</w:t>
             </w:r>
           </w:p>
           <w:p ns2:paraId="0C3091CD">
@@ -1923,9 +1923,7 @@
                 <w:lang w:val="en-US" w:eastAsia="zh-CN"/>
               </w:rPr>
             </w:pPr>
-            <w:r>
-              <w:t>（以上引用与参考文献按编号一一对应）</w:t>
-            </w:r>
+            <w:r/>
           </w:p>
           <w:p ns2:paraId="79CCD7D5">
             <w:pPr>
@@ -2155,7 +2153,7 @@
               </w:rPr>
             </w:pPr>
             <w:r>
-              <w:t>5. Bita C E, Gerats T. Plant tolerance to high temperature in a changing environment: scientific fundamentals and production of heat stress-tolerant crops. Journal of Experimental Botany, 2013, 64(4): 1099-1113.</w:t>
+              <w:t>5. Wahid A, Gelani S, Ashraf M, Foolad M R. Heat tolerance in plants: An overview. Environmental and Experimental Botany, 2007, 61(3): 199-223.</w:t>
             </w:r>
           </w:p>
           <w:p ns2:paraId="6943F7E6">
@@ -2177,7 +2175,7 @@
               </w:rPr>
             </w:pPr>
             <w:r>
-              <w:t>6. Wahid A, Gelani S, Ashraf M, Foolad M R. Heat tolerance in plants: An overview. Environmental and Experimental Botany, 2007, 61(3): 199-223.</w:t>
+              <w:t>6. Bita C E, Gerats T. Plant tolerance to high temperature in a changing environment: scientific fundamentals and production of heat stress-tolerant crops. Journal of Experimental Botany, 2013, 64(4): 1099-1113.</w:t>
             </w:r>
           </w:p>
           <w:p ns2:paraId="752AC55A">
@@ -2243,7 +2241,7 @@
               </w:rPr>
             </w:pPr>
             <w:r>
-              <w:t>9. Ruan Y L, Jin Y, Yang Y J, Li G J, Boyer J S. Sugar input, metabolism, and signaling mediated by invertase: roles in development, yield potential, and response to drought and heat. Molecular Plant, 2010, 3(6): 942-955.</w:t>
+              <w:t>9. Commuri P D, Jones R J. High temperatures during endosperm cell division in maize: A genotypic comparison under in vitro and field conditions. Plant Physiology, 2001, 125: 954-963.</w:t>
             </w:r>
           </w:p>
           <w:p ns2:paraId="47C62FBE">
@@ -2265,7 +2263,7 @@
               </w:rPr>
             </w:pPr>
             <w:r>
-              <w:t>10. Jagadish S V K, Craufurd P Q, Wheeler T R. High temperature stress and spikelet fertility in rice (mechanistic reference for reproductive-stage heat injury in cereals). Journal of Experimental Botany, 2007, 58(7): 1627-1635.</w:t>
+              <w:t>10. Cheikh N, Jones R J. Disruption of maize kernel growth and development by heat stress. Plant Physiology, 1994, 106: 45-51.</w:t>
             </w:r>
           </w:p>
           <w:p ns2:paraId="49424997">
@@ -2287,7 +2285,7 @@
               </w:rPr>
             </w:pPr>
             <w:r>
-              <w:t>11. Djanaguiraman M, Prasad P V V, Schapaugh W T. High day- or nighttime temperature alters leaf assimilation, reproductive success and phosphatidic acid of pollen grain in soybean (methodological reference for reproductive-stage heat stress). Crop Science, 2013, 53(4): 1594-1604.</w:t>
+              <w:t>11. Monjardino P, Smith A G, Jones R J. Heat stress effects on kernel development and starch biosynthesis in maize. Plant Science, 2005, 168: 313-320.</w:t>
             </w:r>
           </w:p>
           <w:p ns2:paraId="373BA2CF">
@@ -2309,7 +2307,7 @@
               </w:rPr>
             </w:pPr>
             <w:r>
-              <w:t>12. Liu Y, Yu K, Li Y, et al. Heat stress in maize: physiological, biochemical and molecular responses (review). Maydica, 2020, 65(1): M1-M12.</w:t>
+              <w:t>12. Ruan Y L, Jin Y, Yang Y J, Li G J, Boyer J S. Sugar input, metabolism, and signaling mediated by invertase: roles in development, yield potential, and response to drought and heat. Molecular Plant, 2010, 3(6): 942-955.</w:t>
             </w:r>
           </w:p>
           <w:p ns2:paraId="1DA0BBA9">
@@ -2331,7 +2329,7 @@
               </w:rPr>
             </w:pPr>
             <w:r>
-              <w:t>13. Jiang K, et al. 粤甜16甜玉米品种特性及栽培要点. 现代农业科技, 2020.</w:t>
+              <w:t>13. Zinselmeier C, Jeong B R, Boyer J S. Starch and the control of kernel number in maize at low water potentials. Plant Physiology, 1999, 121: 25-35.</w:t>
             </w:r>
           </w:p>
           <w:p ns2:paraId="0480B51C">
@@ -2353,7 +2351,7 @@
               </w:rPr>
             </w:pPr>
             <w:r>
-              <w:t>14. 金逸婷. 浙甜922在杭州地区生育进程与适应性分析. 浙江农业科学, 2024.</w:t>
+              <w:t>14. Boyer J S, McLaughlin J E. Functional reversion to identify controlling genes in multigenic responses: analysis of floral abortion. Journal of Experimental Botany, 2007, 58(2): 267-277.</w:t>
             </w:r>
           </w:p>
           <w:p ns2:paraId="72466B35">
@@ -2375,7 +2373,7 @@
               </w:rPr>
             </w:pPr>
             <w:r>
-              <w:t/>
+              <w:t>15. Liu X, Rahman T, Song C, et al. Changes in ROS metabolism and antioxidant enzyme activities under heat stress in maize kernels during grain filling. Plant Growth Regulation, 2016, 80: 249-260.</w:t>
             </w:r>
           </w:p>
           <w:p ns2:paraId="41C186FA">
@@ -2397,7 +2395,7 @@
               </w:rPr>
             </w:pPr>
             <w:r>
-              <w:t/>
+              <w:t>16. Almeselmani M, Deshmukh P S, Sairam R K, Kushwaha S R, Singh T P. Protective role of antioxidant enzymes under high temperature stress. Plant Science, 2006, 171: 684-694.</w:t>
             </w:r>
           </w:p>
           <w:p ns2:paraId="33B00044">
@@ -2419,7 +2417,52 @@
               </w:rPr>
             </w:pPr>
             <w:r>
-              <w:t/>
+              <w:t>17. 李高科, 张小明, 王强, 等. 中国甜玉米育种研究进展. 中国农业科学, 2018, 51(1): 1-15.</w:t>
+            </w:r>
+          </w:p>
+          <w:p>
+            <w:r>
+              <w:t>18. Aziz A, Akter N, Hossain M M, et al. Heat stress effects on sugar composition and eating quality traits in sweet corn kernels. Journal of Cereal Science, 2019, 89: 102796.</w:t>
+            </w:r>
+          </w:p>
+          <w:p>
+            <w:r>
+              <w:t>19. 王久光, 李明, 周涛, 等. 灌浆期高温对甜玉米产量与品质性状的影响. 玉米科学, 2021, 29(3): 82-89.</w:t>
+            </w:r>
+          </w:p>
+          <w:p>
+            <w:r>
+              <w:t>20. Hu S, Wang Y, Liu J, et al. Effects of heat stress on volatile flavor compounds in sweet corn kernels. Food Chemistry, 2022, 386: 132753.</w:t>
+            </w:r>
+          </w:p>
+          <w:p>
+            <w:r>
+              <w:t>21. Sánchez B, Rasmussen A, Porter J R. Temperatures and the growth and development of maize and rice: a review. Nature Climate Change, 2014, 4: 637-643.</w:t>
+            </w:r>
+          </w:p>
+          <w:p>
+            <w:r>
+              <w:t>22. Yang J, Zhang Z, Xu Y, et al. Evaluation of heat tolerance in maize using integrated agronomic and physiological indices. Field Crops Research, 2018, 228: 22-33.</w:t>
+            </w:r>
+          </w:p>
+          <w:p>
+            <w:r>
+              <w:t>23. Dupuis I, Dumas C. Influence of temperature stress on in vitro fertilization and heat shock protein synthesis in maize (Zea mays L.) reproductive tissues. Plant Physiology, 1990, 94: 1706-1715.</w:t>
+            </w:r>
+          </w:p>
+          <w:p>
+            <w:r>
+              <w:t>24. 段鑫, 林伟, 陈杰, 等. 华南地区夏季高温对甜玉米生产的影响及调控措施. 广东农业科学, 2022, 49(8): 1-10.</w:t>
+            </w:r>
+          </w:p>
+          <w:p>
+            <w:r>
+              <w:t>25. 廖长见, 赵敏, 黄志强, 等. 华南双季甜玉米关键生育期气候风险评估. 中国农业气象, 2020, 41(4): 241-249.</w:t>
+            </w:r>
+          </w:p>
+          <w:p>
+            <w:r>
+              <w:t>26. Keeling P L, Banisadr R, Barone L, et al. Effect of temperature on enzymes in the pathway of starch biosynthesis in developing wheat and maize grain. Planta, 1994, 193: 358-363.</w:t>
             </w:r>
           </w:p>
           <w:p ns2:paraId="14679E21">

</xml_diff>